<commit_message>
Planner : tableau Excel nommé TachesVOOMNET + fiche rapide 2 pages
</commit_message>
<xml_diff>
--- a/docs/planner/GUIDE-PLANNER.docx
+++ b/docs/planner/GUIDE-PLANNER.docx
@@ -540,7 +540,7 @@
         <w:rPr>
           <w:b w:val="0"/>
         </w:rPr>
-        <w:t xml:space="preserve">Déposer `VOOMNET-planner.csv` (converti en classeur Excel) dans </w:t>
+        <w:t xml:space="preserve">Déposer `VOOMNET-planner.xlsx` dans </w:t>
       </w:r>
       <w:r>
         <w:rPr>
@@ -550,26 +550,23 @@
       </w:r>
     </w:p>
     <w:p>
-      <w:pPr>
-        <w:pStyle w:val="ListNumber"/>
-      </w:pPr>
       <w:r>
         <w:rPr>
           <w:b w:val="0"/>
         </w:rPr>
-        <w:t xml:space="preserve">Dans le fichier Excel : </w:t>
+        <w:t xml:space="preserve">👉 *le fichier contient déjà un vrai tableau Excel nommé </w:t>
       </w:r>
       <w:r>
         <w:rPr>
           <w:b/>
         </w:rPr>
-        <w:t>Insertion -&gt; Tableau</w:t>
+        <w:t>`TachesVOOMNET`</w:t>
       </w:r>
       <w:r>
         <w:rPr>
           <w:b w:val="0"/>
         </w:rPr>
-        <w:t xml:space="preserve"> (donner un nom, par exemple `Taches`)</w:t>
+        <w:t xml:space="preserve"> (onglet « Taches ») — aucune préparation n'est nécessaire</w:t>
       </w:r>
     </w:p>
     <w:p>
@@ -620,7 +617,7 @@
         <w:rPr>
           <w:b/>
         </w:rPr>
-        <w:t>Excel Online — Répertorier les lignes présentes dans un tableau</w:t>
+        <w:t>Excel Online (Business) — Répertorier les lignes présentes dans un tableau</w:t>
       </w:r>
       <w:r>
         <w:rPr>
@@ -637,7 +634,30 @@
         <w:rPr>
           <w:b w:val="0"/>
         </w:rPr>
-        <w:t>Emplacement : OneDrive · Bibliothèque : OneDrive · Fichier : votre classeur · Tableau : `Taches`</w:t>
+        <w:t>Emplacement : OneDrive · Bibliothèque de documents : OneDrive · Fichier : `VOOMNET-planner.xlsx`</w:t>
+      </w:r>
+    </w:p>
+    <w:p>
+      <w:pPr>
+        <w:pStyle w:val="ListBullet"/>
+      </w:pPr>
+      <w:r>
+        <w:rPr>
+          <w:b w:val="0"/>
+        </w:rPr>
+        <w:t xml:space="preserve">Tableau : </w:t>
+      </w:r>
+      <w:r>
+        <w:rPr>
+          <w:b/>
+        </w:rPr>
+        <w:t>`TachesVOOMNET`</w:t>
+      </w:r>
+      <w:r>
+        <w:rPr>
+          <w:b w:val="0"/>
+        </w:rPr>
+        <w:t xml:space="preserve"> (apparaît directement dans la liste déroulante)</w:t>
       </w:r>
     </w:p>
     <w:p>

</xml_diff>

<commit_message>
Planner : export Grille 9 colonnes validé + lecture par vue (Tableau, Graphiques, Planning)
</commit_message>
<xml_diff>
--- a/docs/planner/GUIDE-PLANNER.docx
+++ b/docs/planner/GUIDE-PLANNER.docx
@@ -1062,185 +1062,93 @@
         <w:pStyle w:val="Heading1"/>
       </w:pPr>
       <w:r>
-        <w:t>Ce que votre responsable verra</w:t>
+        <w:t>Basculer entre les vues</w:t>
       </w:r>
     </w:p>
-    <w:tbl>
-      <w:tblPr>
-        <w:tblStyle w:val="TableGrid"/>
-        <w:tblW w:type="auto" w:w="0"/>
-        <w:tblLook w:firstColumn="1" w:firstRow="1" w:lastColumn="0" w:lastRow="0" w:noHBand="0" w:noVBand="1" w:val="04A0"/>
-      </w:tblPr>
-      <w:tblGrid>
-        <w:gridCol w:w="4986"/>
-        <w:gridCol w:w="4986"/>
-      </w:tblGrid>
-      <w:tr>
-        <w:tc>
-          <w:tcPr>
-            <w:tcW w:type="dxa" w:w="4986"/>
-          </w:tcPr>
-          <w:p>
-            <w:r/>
-            <w:r>
-              <w:rPr>
-                <w:b/>
-                <w:sz w:val="17"/>
-              </w:rPr>
-              <w:t>Vue</w:t>
-            </w:r>
-          </w:p>
-        </w:tc>
-        <w:tc>
-          <w:tcPr>
-            <w:tcW w:type="dxa" w:w="4986"/>
-          </w:tcPr>
-          <w:p>
-            <w:r/>
-            <w:r>
-              <w:rPr>
-                <w:b/>
-                <w:sz w:val="17"/>
-              </w:rPr>
-              <w:t>Ce qu'elle montre</w:t>
-            </w:r>
-          </w:p>
-        </w:tc>
-      </w:tr>
-      <w:tr>
-        <w:tc>
-          <w:tcPr>
-            <w:tcW w:type="dxa" w:w="4986"/>
-          </w:tcPr>
-          <w:p>
-            <w:r/>
-            <w:r>
-              <w:rPr>
-                <w:sz w:val="17"/>
-              </w:rPr>
-              <w:t>**Tableau**</w:t>
-            </w:r>
-          </w:p>
-        </w:tc>
-        <w:tc>
-          <w:tcPr>
-            <w:tcW w:type="dxa" w:w="4986"/>
-          </w:tcPr>
-          <w:p>
-            <w:r/>
-            <w:r>
-              <w:rPr>
-                <w:sz w:val="17"/>
-              </w:rPr>
-              <w:t>les tâches par compartiment (Livré / En cours / Planifié)</w:t>
-            </w:r>
-          </w:p>
-        </w:tc>
-      </w:tr>
-      <w:tr>
-        <w:tc>
-          <w:tcPr>
-            <w:tcW w:type="dxa" w:w="4986"/>
-          </w:tcPr>
-          <w:p>
-            <w:r/>
-            <w:r>
-              <w:rPr>
-                <w:sz w:val="17"/>
-              </w:rPr>
-              <w:t>**Graphiques**</w:t>
-            </w:r>
-          </w:p>
-        </w:tc>
-        <w:tc>
-          <w:tcPr>
-            <w:tcW w:type="dxa" w:w="4986"/>
-          </w:tcPr>
-          <w:p>
-            <w:r/>
-            <w:r>
-              <w:rPr>
-                <w:sz w:val="17"/>
-              </w:rPr>
-              <w:t>répartition par statut, par compartiment, par étiquette et par personne</w:t>
-            </w:r>
-          </w:p>
-        </w:tc>
-      </w:tr>
-      <w:tr>
-        <w:tc>
-          <w:tcPr>
-            <w:tcW w:type="dxa" w:w="4986"/>
-          </w:tcPr>
-          <w:p>
-            <w:r/>
-            <w:r>
-              <w:rPr>
-                <w:sz w:val="17"/>
-              </w:rPr>
-              <w:t>**Planning**</w:t>
-            </w:r>
-          </w:p>
-        </w:tc>
-        <w:tc>
-          <w:tcPr>
-            <w:tcW w:type="dxa" w:w="4986"/>
-          </w:tcPr>
-          <w:p>
-            <w:r/>
-            <w:r>
-              <w:rPr>
-                <w:sz w:val="17"/>
-              </w:rPr>
-              <w:t>le calendrier des échéances (vue chronologique)</w:t>
-            </w:r>
-          </w:p>
-        </w:tc>
-      </w:tr>
-      <w:tr>
-        <w:tc>
-          <w:tcPr>
-            <w:tcW w:type="dxa" w:w="4986"/>
-          </w:tcPr>
-          <w:p>
-            <w:r/>
-            <w:r>
-              <w:rPr>
-                <w:sz w:val="17"/>
-              </w:rPr>
-              <w:t>**Grille**</w:t>
-            </w:r>
-          </w:p>
-        </w:tc>
-        <w:tc>
-          <w:tcPr>
-            <w:tcW w:type="dxa" w:w="4986"/>
-          </w:tcPr>
-          <w:p>
-            <w:r/>
-            <w:r>
-              <w:rPr>
-                <w:sz w:val="17"/>
-              </w:rPr>
-              <w:t>le tableau détaillé avec dates, progression et responsables</w:t>
-            </w:r>
-          </w:p>
-        </w:tc>
-      </w:tr>
-    </w:tbl>
-    <w:p/>
     <w:p>
       <w:r>
         <w:rPr>
           <w:b w:val="0"/>
         </w:rPr>
-        <w:t xml:space="preserve">Le point clé : les vues </w:t>
+        <w:t>Dans la barre supérieure du plan (à côté du nom du plan) :</w:t>
       </w:r>
+    </w:p>
+    <w:p>
+      <w:r>
+        <w:rPr>
+          <w:rFonts w:ascii="Consolas" w:hAnsi="Consolas"/>
+          <w:sz w:val="17"/>
+        </w:rPr>
+        <w:t>Tableau   Grille   Planning   Graphiques   Membres</w:t>
+      </w:r>
+    </w:p>
+    <w:p>
+      <w:r>
+        <w:rPr>
+          <w:b w:val="0"/>
+        </w:rPr>
+        <w:t>Le mode sombre ne change pas ces libellés : ils restent dans le même ordre.</w:t>
+      </w:r>
+    </w:p>
+    <w:p>
+      <w:pPr>
+        <w:pStyle w:val="Heading1"/>
+      </w:pPr>
+      <w:r>
+        <w:t>Ce que votre responsable verra, vue par vue</w:t>
+      </w:r>
+    </w:p>
+    <w:p>
+      <w:pPr>
+        <w:pStyle w:val="Heading2"/>
+      </w:pPr>
+      <w:r>
+        <w:t>(excel) Vue Graphiques — la plus parlante pour un responsable</w:t>
+      </w:r>
+    </w:p>
+    <w:p>
+      <w:pPr>
+        <w:pStyle w:val="ListBullet"/>
+      </w:pPr>
       <w:r>
         <w:rPr>
           <w:b/>
         </w:rPr>
-        <w:t>Graphiques</w:t>
+        <w:t>Répartition par progression</w:t>
+      </w:r>
+      <w:r>
+        <w:rPr>
+          <w:b w:val="0"/>
+        </w:rPr>
+        <w:t xml:space="preserve"> : camembert *Terminé / En cours / En retard / Pas commencé</w:t>
+      </w:r>
+    </w:p>
+    <w:p>
+      <w:pPr>
+        <w:pStyle w:val="ListBullet"/>
+      </w:pPr>
+      <w:r>
+        <w:rPr>
+          <w:b/>
+        </w:rPr>
+        <w:t>Par compartiment</w:t>
+      </w:r>
+      <w:r>
+        <w:rPr>
+          <w:b w:val="0"/>
+        </w:rPr>
+        <w:t xml:space="preserve"> : combien de tâches dans `[OK] Livré`, `🔄 En cours`, `📅 Planifié`</w:t>
+      </w:r>
+    </w:p>
+    <w:p>
+      <w:pPr>
+        <w:pStyle w:val="ListBullet"/>
+      </w:pPr>
+      <w:r>
+        <w:rPr>
+          <w:b/>
+        </w:rPr>
+        <w:t>Par étiquette</w:t>
       </w:r>
       <w:r>
         <w:rPr>
@@ -1252,13 +1160,205 @@
         <w:rPr>
           <w:b/>
         </w:rPr>
-        <w:t>Planning</w:t>
+        <w:t>par personne</w:t>
       </w:r>
       <w:r>
         <w:rPr>
           <w:b w:val="0"/>
         </w:rPr>
-        <w:t xml:space="preserve"> donnent une lecture immédiate de l'avancement sans ouvrir chaque tâche.</w:t>
+        <w:t xml:space="preserve"> : la charge par module et par intervenant</w:t>
+      </w:r>
+    </w:p>
+    <w:p>
+      <w:r>
+        <w:rPr>
+          <w:b w:val="0"/>
+        </w:rPr>
+        <w:t>👉 C'est la vue à montrer en réunion : l'avancement saute aux yeux sans lire de liste.</w:t>
+      </w:r>
+    </w:p>
+    <w:p>
+      <w:pPr>
+        <w:pStyle w:val="Heading2"/>
+      </w:pPr>
+      <w:r>
+        <w:t>📅 Vue Planning — la vue calendaire</w:t>
+      </w:r>
+    </w:p>
+    <w:p>
+      <w:pPr>
+        <w:pStyle w:val="ListBullet"/>
+      </w:pPr>
+      <w:r>
+        <w:rPr>
+          <w:b w:val="0"/>
+        </w:rPr>
+        <w:t xml:space="preserve">Les tâches positionnées sur leur </w:t>
+      </w:r>
+      <w:r>
+        <w:rPr>
+          <w:b/>
+        </w:rPr>
+        <w:t>semaine d'échéance</w:t>
+      </w:r>
+    </w:p>
+    <w:p>
+      <w:pPr>
+        <w:pStyle w:val="ListBullet"/>
+      </w:pPr>
+      <w:r>
+        <w:rPr>
+          <w:b w:val="0"/>
+        </w:rPr>
+        <w:t>Idéal pour répondre à « où en sera-t-on à la fin du mois ? »</w:t>
+      </w:r>
+    </w:p>
+    <w:p>
+      <w:pPr>
+        <w:pStyle w:val="ListBullet"/>
+      </w:pPr>
+      <w:r>
+        <w:rPr>
+          <w:b w:val="0"/>
+        </w:rPr>
+        <w:t>Astuce : les tâches `[OK] Livré` apparaissent également, ce qui matérialise le chemin parcouru</w:t>
+      </w:r>
+    </w:p>
+    <w:p>
+      <w:pPr>
+        <w:pStyle w:val="Heading2"/>
+      </w:pPr>
+      <w:r>
+        <w:t>🗂 Vue Tableau — la vue par compartiments</w:t>
+      </w:r>
+    </w:p>
+    <w:p>
+      <w:pPr>
+        <w:pStyle w:val="ListBullet"/>
+      </w:pPr>
+      <w:r>
+        <w:rPr>
+          <w:b w:val="0"/>
+        </w:rPr>
+        <w:t>3 colonnes : `[OK] Livré` · `🔄 En cours` · `📅 Planifié`</w:t>
+      </w:r>
+    </w:p>
+    <w:p>
+      <w:pPr>
+        <w:pStyle w:val="ListBullet"/>
+      </w:pPr>
+      <w:r>
+        <w:rPr>
+          <w:b w:val="0"/>
+        </w:rPr>
+        <w:t xml:space="preserve">Chaque carte affiche : titre, </w:t>
+      </w:r>
+      <w:r>
+        <w:rPr>
+          <w:b/>
+        </w:rPr>
+        <w:t>étiquette de couleur</w:t>
+      </w:r>
+      <w:r>
+        <w:rPr>
+          <w:b w:val="0"/>
+        </w:rPr>
+        <w:t xml:space="preserve"> (module), échéance, assigné et</w:t>
+      </w:r>
+    </w:p>
+    <w:p>
+      <w:r>
+        <w:rPr>
+          <w:b w:val="0"/>
+        </w:rPr>
+        <w:t>l'icône de progression</w:t>
+      </w:r>
+    </w:p>
+    <w:p>
+      <w:pPr>
+        <w:pStyle w:val="ListBullet"/>
+      </w:pPr>
+      <w:r>
+        <w:rPr>
+          <w:b w:val="0"/>
+        </w:rPr>
+        <w:t>La plus proche de l'usage quotidien ; c'est celle que vous mettrez à jour chaque semaine</w:t>
+      </w:r>
+    </w:p>
+    <w:p>
+      <w:pPr>
+        <w:pStyle w:val="Heading2"/>
+      </w:pPr>
+      <w:r>
+        <w:t>🗒 Vue Grille — la vue tableur (celle de la 1re capture)</w:t>
+      </w:r>
+    </w:p>
+    <w:p>
+      <w:pPr>
+        <w:pStyle w:val="ListBullet"/>
+      </w:pPr>
+      <w:r>
+        <w:rPr>
+          <w:b w:val="0"/>
+        </w:rPr>
+        <w:t>Tableau complet avec toutes les colonnes : *Nom de la tâche · Compartiment · Progression ·</w:t>
+      </w:r>
+    </w:p>
+    <w:p>
+      <w:r>
+        <w:rPr>
+          <w:b w:val="0"/>
+        </w:rPr>
+        <w:t>Priorité · Assigné à · Date de début · Date d'échéance · Étiquettes · Description</w:t>
+      </w:r>
+    </w:p>
+    <w:p>
+      <w:pPr>
+        <w:pStyle w:val="ListBullet"/>
+      </w:pPr>
+      <w:r>
+        <w:rPr>
+          <w:b w:val="0"/>
+        </w:rPr>
+        <w:t xml:space="preserve">C'est la vue où l'on </w:t>
+      </w:r>
+      <w:r>
+        <w:rPr>
+          <w:b/>
+        </w:rPr>
+        <w:t>colle</w:t>
+      </w:r>
+      <w:r>
+        <w:rPr>
+          <w:b w:val="0"/>
+        </w:rPr>
+        <w:t xml:space="preserve"> les données (méthode B ci-dessous) et où l'on peut</w:t>
+      </w:r>
+    </w:p>
+    <w:p>
+      <w:r>
+        <w:rPr>
+          <w:b w:val="0"/>
+        </w:rPr>
+        <w:t>renseigner toutes les informations en masse</w:t>
+      </w:r>
+    </w:p>
+    <w:p>
+      <w:r>
+        <w:rPr>
+          <w:i/>
+          <w:color w:val="475569"/>
+        </w:rPr>
+        <w:t>**Conseil** : montrez les **Graphiques** à votre responsable (lecture immédiate) et</w:t>
+      </w:r>
+    </w:p>
+    <w:p>
+      <w:r>
+        <w:rPr>
+          <w:i/>
+          <w:color w:val="475569"/>
+        </w:rPr>
+        <w:t>gardez le **Tableau** pour le suivi opérationnel hebdomadaire.</w:t>
       </w:r>
     </w:p>
     <w:p>
@@ -1483,7 +1583,7 @@
               <w:rPr>
                 <w:sz w:val="17"/>
               </w:rPr>
-              <w:t>`VOOMNET-planner.xlsx`</w:t>
+              <w:t>**`a-coller-DANS-LA-GRILLE.tsv`**</w:t>
             </w:r>
           </w:p>
         </w:tc>
@@ -1497,7 +1597,67 @@
               <w:rPr>
                 <w:sz w:val="17"/>
               </w:rPr>
-              <w:t>suivi complet + onglets de collage par compartiment</w:t>
+              <w:t>**les 44 tâches formatées pour la vue Grille (9 colonnes) — à coller directement**</w:t>
+            </w:r>
+          </w:p>
+        </w:tc>
+      </w:tr>
+      <w:tr>
+        <w:tc>
+          <w:tcPr>
+            <w:tcW w:type="dxa" w:w="4986"/>
+          </w:tcPr>
+          <w:p>
+            <w:r/>
+            <w:r>
+              <w:rPr>
+                <w:sz w:val="17"/>
+              </w:rPr>
+              <w:t>**`VOOMNET-planner-GRILLE.csv`**</w:t>
+            </w:r>
+          </w:p>
+        </w:tc>
+        <w:tc>
+          <w:tcPr>
+            <w:tcW w:type="dxa" w:w="4986"/>
+          </w:tcPr>
+          <w:p>
+            <w:r/>
+            <w:r>
+              <w:rPr>
+                <w:sz w:val="17"/>
+              </w:rPr>
+              <w:t>idem au format CSV (séparateur point-virgule)</w:t>
+            </w:r>
+          </w:p>
+        </w:tc>
+      </w:tr>
+      <w:tr>
+        <w:tc>
+          <w:tcPr>
+            <w:tcW w:type="dxa" w:w="4986"/>
+          </w:tcPr>
+          <w:p>
+            <w:r/>
+            <w:r>
+              <w:rPr>
+                <w:sz w:val="17"/>
+              </w:rPr>
+              <w:t>**`VOOMNET-planner.xlsx`**</w:t>
+            </w:r>
+          </w:p>
+        </w:tc>
+        <w:tc>
+          <w:tcPr>
+            <w:tcW w:type="dxa" w:w="4986"/>
+          </w:tcPr>
+          <w:p>
+            <w:r/>
+            <w:r>
+              <w:rPr>
+                <w:sz w:val="17"/>
+              </w:rPr>
+              <w:t>classeur complet : onglet `Grille` (tableau `GrilleVOOMNET`), onglet `Taches` (tableau `TachesVOOMNET`), onglet `Suivi`, onglets de collage par compartiment</w:t>
             </w:r>
           </w:p>
         </w:tc>
@@ -1527,13 +1687,67 @@
               <w:rPr>
                 <w:sz w:val="17"/>
               </w:rPr>
-              <w:t>données brutes (pour Power Automate ou Excel)</w:t>
+              <w:t>données brutes (Power Automate ou Excel)</w:t>
+            </w:r>
+          </w:p>
+        </w:tc>
+      </w:tr>
+      <w:tr>
+        <w:tc>
+          <w:tcPr>
+            <w:tcW w:type="dxa" w:w="4986"/>
+          </w:tcPr>
+          <w:p>
+            <w:r/>
+            <w:r>
+              <w:rPr>
+                <w:sz w:val="17"/>
+              </w:rPr>
+              <w:t>`FICHE-RAPIDE.pdf`</w:t>
+            </w:r>
+          </w:p>
+        </w:tc>
+        <w:tc>
+          <w:tcPr>
+            <w:tcW w:type="dxa" w:w="4986"/>
+          </w:tcPr>
+          <w:p>
+            <w:r/>
+            <w:r>
+              <w:rPr>
+                <w:sz w:val="17"/>
+              </w:rPr>
+              <w:t>la procédure en 1 page</w:t>
             </w:r>
           </w:p>
         </w:tc>
       </w:tr>
     </w:tbl>
     <w:p/>
+    <w:p>
+      <w:pPr>
+        <w:pStyle w:val="Heading2"/>
+      </w:pPr>
+      <w:r>
+        <w:t>Colonnes de l'export Grille (validées)</w:t>
+      </w:r>
+    </w:p>
+    <w:p>
+      <w:r>
+        <w:rPr>
+          <w:b w:val="0"/>
+        </w:rPr>
+        <w:t>`Nom de la tâche` · `Compartiment` · `Progression` · `Priorité` · `Assigné à` · `Date de début` · `Date d'échéance` · `Étiquettes` · `Description`</w:t>
+      </w:r>
+    </w:p>
+    <w:p>
+      <w:r>
+        <w:rPr>
+          <w:b w:val="0"/>
+        </w:rPr>
+        <w:t>Valeurs prêtes pour Planner : Progression = `Terminé` / `En cours` / `Pas commencé` ; Priorité = `Urgent` / `Moyen` / `Faible` ; Étiquettes = module concerné.</w:t>
+      </w:r>
+    </w:p>
     <w:p>
       <w:pPr>
         <w:pStyle w:val="Heading1"/>

</xml_diff>

<commit_message>
Planner : colonnes Developpement / Test / Pilote / Deploiement + taches par etape et checklists
</commit_message>
<xml_diff>
--- a/docs/planner/GUIDE-PLANNER.docx
+++ b/docs/planner/GUIDE-PLANNER.docx
@@ -24,7 +24,7 @@
           <w:color w:val="000060"/>
           <w:sz w:val="28"/>
         </w:rPr>
-        <w:t>VOOMNET TECHNOLOGY — procédure de mise en place</w:t>
+        <w:t>VOOMNET TECHNOLOGY — procédure et colonnes d'étapes</w:t>
       </w:r>
     </w:p>
     <w:p/>
@@ -1437,6 +1437,869 @@
         <w:pStyle w:val="Heading1"/>
       </w:pPr>
       <w:r>
+        <w:t>Les 4 colonnes d'étapes : Développement · Test · Pilote · Déploiement</w:t>
+      </w:r>
+    </w:p>
+    <w:p>
+      <w:r>
+        <w:rPr>
+          <w:b w:val="0"/>
+        </w:rPr>
+        <w:t xml:space="preserve">Ces colonnes suivent le </w:t>
+      </w:r>
+      <w:r>
+        <w:rPr>
+          <w:b/>
+        </w:rPr>
+        <w:t>cycle de vie de chaque fonctionnalité</w:t>
+      </w:r>
+      <w:r>
+        <w:rPr>
+          <w:b w:val="0"/>
+        </w:rPr>
+        <w:t>. Elles complètent la colonne « Progression » (qui donne la vue d'ensemble).</w:t>
+      </w:r>
+    </w:p>
+    <w:p>
+      <w:pPr>
+        <w:pStyle w:val="Heading2"/>
+      </w:pPr>
+      <w:r>
+        <w:t>Signification</w:t>
+      </w:r>
+    </w:p>
+    <w:tbl>
+      <w:tblPr>
+        <w:tblStyle w:val="TableGrid"/>
+        <w:tblW w:type="auto" w:w="0"/>
+        <w:tblLook w:firstColumn="1" w:firstRow="1" w:lastColumn="0" w:lastRow="0" w:noHBand="0" w:noVBand="1" w:val="04A0"/>
+      </w:tblPr>
+      <w:tblGrid>
+        <w:gridCol w:w="3324"/>
+        <w:gridCol w:w="3324"/>
+        <w:gridCol w:w="3324"/>
+      </w:tblGrid>
+      <w:tr>
+        <w:tc>
+          <w:tcPr>
+            <w:tcW w:type="dxa" w:w="3324"/>
+          </w:tcPr>
+          <w:p>
+            <w:r/>
+            <w:r>
+              <w:rPr>
+                <w:b/>
+                <w:sz w:val="17"/>
+              </w:rPr>
+              <w:t>Colonne</w:t>
+            </w:r>
+          </w:p>
+        </w:tc>
+        <w:tc>
+          <w:tcPr>
+            <w:tcW w:type="dxa" w:w="3324"/>
+          </w:tcPr>
+          <w:p>
+            <w:r/>
+            <w:r>
+              <w:rPr>
+                <w:b/>
+                <w:sz w:val="17"/>
+              </w:rPr>
+              <w:t>Ce qu'elle mesure</w:t>
+            </w:r>
+          </w:p>
+        </w:tc>
+        <w:tc>
+          <w:tcPr>
+            <w:tcW w:type="dxa" w:w="3324"/>
+          </w:tcPr>
+          <w:p>
+            <w:r/>
+            <w:r>
+              <w:rPr>
+                <w:b/>
+                <w:sz w:val="17"/>
+              </w:rPr>
+              <w:t>Valeurs possibles</w:t>
+            </w:r>
+          </w:p>
+        </w:tc>
+      </w:tr>
+      <w:tr>
+        <w:tc>
+          <w:tcPr>
+            <w:tcW w:type="dxa" w:w="3324"/>
+          </w:tcPr>
+          <w:p>
+            <w:r/>
+            <w:r>
+              <w:rPr>
+                <w:sz w:val="17"/>
+              </w:rPr>
+              <w:t>**Développement**</w:t>
+            </w:r>
+          </w:p>
+        </w:tc>
+        <w:tc>
+          <w:tcPr>
+            <w:tcW w:type="dxa" w:w="3324"/>
+          </w:tcPr>
+          <w:p>
+            <w:r/>
+            <w:r>
+              <w:rPr>
+                <w:sz w:val="17"/>
+              </w:rPr>
+              <w:t>la fonctionnalité est-elle codée ?</w:t>
+            </w:r>
+          </w:p>
+        </w:tc>
+        <w:tc>
+          <w:tcPr>
+            <w:tcW w:type="dxa" w:w="3324"/>
+          </w:tcPr>
+          <w:p>
+            <w:r/>
+            <w:r>
+              <w:rPr>
+                <w:sz w:val="17"/>
+              </w:rPr>
+              <w:t>`Terminé` · `En cours` · `Pas commencé`</w:t>
+            </w:r>
+          </w:p>
+        </w:tc>
+      </w:tr>
+      <w:tr>
+        <w:tc>
+          <w:tcPr>
+            <w:tcW w:type="dxa" w:w="3324"/>
+          </w:tcPr>
+          <w:p>
+            <w:r/>
+            <w:r>
+              <w:rPr>
+                <w:sz w:val="17"/>
+              </w:rPr>
+              <w:t>**Test**</w:t>
+            </w:r>
+          </w:p>
+        </w:tc>
+        <w:tc>
+          <w:tcPr>
+            <w:tcW w:type="dxa" w:w="3324"/>
+          </w:tcPr>
+          <w:p>
+            <w:r/>
+            <w:r>
+              <w:rPr>
+                <w:sz w:val="17"/>
+              </w:rPr>
+              <w:t>a-t-elle été vérifiée (tests automatisés, recette) ?</w:t>
+            </w:r>
+          </w:p>
+        </w:tc>
+        <w:tc>
+          <w:tcPr>
+            <w:tcW w:type="dxa" w:w="3324"/>
+          </w:tcPr>
+          <w:p>
+            <w:r/>
+            <w:r>
+              <w:rPr>
+                <w:sz w:val="17"/>
+              </w:rPr>
+              <w:t>idem</w:t>
+            </w:r>
+          </w:p>
+        </w:tc>
+      </w:tr>
+      <w:tr>
+        <w:tc>
+          <w:tcPr>
+            <w:tcW w:type="dxa" w:w="3324"/>
+          </w:tcPr>
+          <w:p>
+            <w:r/>
+            <w:r>
+              <w:rPr>
+                <w:sz w:val="17"/>
+              </w:rPr>
+              <w:t>**Pilote**</w:t>
+            </w:r>
+          </w:p>
+        </w:tc>
+        <w:tc>
+          <w:tcPr>
+            <w:tcW w:type="dxa" w:w="3324"/>
+          </w:tcPr>
+          <w:p>
+            <w:r/>
+            <w:r>
+              <w:rPr>
+                <w:sz w:val="17"/>
+              </w:rPr>
+              <w:t>est-elle validée par un groupe d'utilisateurs ?</w:t>
+            </w:r>
+          </w:p>
+        </w:tc>
+        <w:tc>
+          <w:tcPr>
+            <w:tcW w:type="dxa" w:w="3324"/>
+          </w:tcPr>
+          <w:p>
+            <w:r/>
+            <w:r>
+              <w:rPr>
+                <w:sz w:val="17"/>
+              </w:rPr>
+              <w:t>idem</w:t>
+            </w:r>
+          </w:p>
+        </w:tc>
+      </w:tr>
+      <w:tr>
+        <w:tc>
+          <w:tcPr>
+            <w:tcW w:type="dxa" w:w="3324"/>
+          </w:tcPr>
+          <w:p>
+            <w:r/>
+            <w:r>
+              <w:rPr>
+                <w:sz w:val="17"/>
+              </w:rPr>
+              <w:t>**Déploiement**</w:t>
+            </w:r>
+          </w:p>
+        </w:tc>
+        <w:tc>
+          <w:tcPr>
+            <w:tcW w:type="dxa" w:w="3324"/>
+          </w:tcPr>
+          <w:p>
+            <w:r/>
+            <w:r>
+              <w:rPr>
+                <w:sz w:val="17"/>
+              </w:rPr>
+              <w:t>est-elle en production, visible de tous ?</w:t>
+            </w:r>
+          </w:p>
+        </w:tc>
+        <w:tc>
+          <w:tcPr>
+            <w:tcW w:type="dxa" w:w="3324"/>
+          </w:tcPr>
+          <w:p>
+            <w:r/>
+            <w:r>
+              <w:rPr>
+                <w:sz w:val="17"/>
+              </w:rPr>
+              <w:t>idem</w:t>
+            </w:r>
+          </w:p>
+        </w:tc>
+      </w:tr>
+    </w:tbl>
+    <w:p/>
+    <w:p>
+      <w:pPr>
+        <w:pStyle w:val="Heading2"/>
+      </w:pPr>
+      <w:r>
+        <w:t>Comment les colonnes sont remplies</w:t>
+      </w:r>
+    </w:p>
+    <w:p>
+      <w:r>
+        <w:rPr>
+          <w:b w:val="0"/>
+        </w:rPr>
+        <w:t>L'état des étapes est déduit de l'avancement de la tâche :</w:t>
+      </w:r>
+    </w:p>
+    <w:tbl>
+      <w:tblPr>
+        <w:tblStyle w:val="TableGrid"/>
+        <w:tblW w:type="auto" w:w="0"/>
+        <w:tblLook w:firstColumn="1" w:firstRow="1" w:lastColumn="0" w:lastRow="0" w:noHBand="0" w:noVBand="1" w:val="04A0"/>
+      </w:tblPr>
+      <w:tblGrid>
+        <w:gridCol w:w="1994"/>
+        <w:gridCol w:w="1994"/>
+        <w:gridCol w:w="1994"/>
+        <w:gridCol w:w="1994"/>
+        <w:gridCol w:w="1994"/>
+      </w:tblGrid>
+      <w:tr>
+        <w:tc>
+          <w:tcPr>
+            <w:tcW w:type="dxa" w:w="1994"/>
+          </w:tcPr>
+          <w:p>
+            <w:r/>
+            <w:r>
+              <w:rPr>
+                <w:b/>
+                <w:sz w:val="17"/>
+              </w:rPr>
+              <w:t>Avancement</w:t>
+            </w:r>
+          </w:p>
+        </w:tc>
+        <w:tc>
+          <w:tcPr>
+            <w:tcW w:type="dxa" w:w="1994"/>
+          </w:tcPr>
+          <w:p>
+            <w:r/>
+            <w:r>
+              <w:rPr>
+                <w:b/>
+                <w:sz w:val="17"/>
+              </w:rPr>
+              <w:t>Développement</w:t>
+            </w:r>
+          </w:p>
+        </w:tc>
+        <w:tc>
+          <w:tcPr>
+            <w:tcW w:type="dxa" w:w="1994"/>
+          </w:tcPr>
+          <w:p>
+            <w:r/>
+            <w:r>
+              <w:rPr>
+                <w:b/>
+                <w:sz w:val="17"/>
+              </w:rPr>
+              <w:t>Test</w:t>
+            </w:r>
+          </w:p>
+        </w:tc>
+        <w:tc>
+          <w:tcPr>
+            <w:tcW w:type="dxa" w:w="1994"/>
+          </w:tcPr>
+          <w:p>
+            <w:r/>
+            <w:r>
+              <w:rPr>
+                <w:b/>
+                <w:sz w:val="17"/>
+              </w:rPr>
+              <w:t>Pilote</w:t>
+            </w:r>
+          </w:p>
+        </w:tc>
+        <w:tc>
+          <w:tcPr>
+            <w:tcW w:type="dxa" w:w="1994"/>
+          </w:tcPr>
+          <w:p>
+            <w:r/>
+            <w:r>
+              <w:rPr>
+                <w:b/>
+                <w:sz w:val="17"/>
+              </w:rPr>
+              <w:t>Déploiement</w:t>
+            </w:r>
+          </w:p>
+        </w:tc>
+      </w:tr>
+      <w:tr>
+        <w:tc>
+          <w:tcPr>
+            <w:tcW w:type="dxa" w:w="1994"/>
+          </w:tcPr>
+          <w:p>
+            <w:r/>
+            <w:r>
+              <w:rPr>
+                <w:sz w:val="17"/>
+              </w:rPr>
+              <w:t>**100 %** (livré)</w:t>
+            </w:r>
+          </w:p>
+        </w:tc>
+        <w:tc>
+          <w:tcPr>
+            <w:tcW w:type="dxa" w:w="1994"/>
+          </w:tcPr>
+          <w:p>
+            <w:r/>
+            <w:r>
+              <w:rPr>
+                <w:sz w:val="17"/>
+              </w:rPr>
+              <w:t>Terminé</w:t>
+            </w:r>
+          </w:p>
+        </w:tc>
+        <w:tc>
+          <w:tcPr>
+            <w:tcW w:type="dxa" w:w="1994"/>
+          </w:tcPr>
+          <w:p>
+            <w:r/>
+            <w:r>
+              <w:rPr>
+                <w:sz w:val="17"/>
+              </w:rPr>
+              <w:t>Terminé</w:t>
+            </w:r>
+          </w:p>
+        </w:tc>
+        <w:tc>
+          <w:tcPr>
+            <w:tcW w:type="dxa" w:w="1994"/>
+          </w:tcPr>
+          <w:p>
+            <w:r/>
+            <w:r>
+              <w:rPr>
+                <w:sz w:val="17"/>
+              </w:rPr>
+              <w:t>Terminé</w:t>
+            </w:r>
+          </w:p>
+        </w:tc>
+        <w:tc>
+          <w:tcPr>
+            <w:tcW w:type="dxa" w:w="1994"/>
+          </w:tcPr>
+          <w:p>
+            <w:r/>
+            <w:r>
+              <w:rPr>
+                <w:sz w:val="17"/>
+              </w:rPr>
+              <w:t>Terminé</w:t>
+            </w:r>
+          </w:p>
+        </w:tc>
+      </w:tr>
+      <w:tr>
+        <w:tc>
+          <w:tcPr>
+            <w:tcW w:type="dxa" w:w="1994"/>
+          </w:tcPr>
+          <w:p>
+            <w:r/>
+            <w:r>
+              <w:rPr>
+                <w:sz w:val="17"/>
+              </w:rPr>
+              <w:t>**≥ 60 %**</w:t>
+            </w:r>
+          </w:p>
+        </w:tc>
+        <w:tc>
+          <w:tcPr>
+            <w:tcW w:type="dxa" w:w="1994"/>
+          </w:tcPr>
+          <w:p>
+            <w:r/>
+            <w:r>
+              <w:rPr>
+                <w:sz w:val="17"/>
+              </w:rPr>
+              <w:t>Terminé</w:t>
+            </w:r>
+          </w:p>
+        </w:tc>
+        <w:tc>
+          <w:tcPr>
+            <w:tcW w:type="dxa" w:w="1994"/>
+          </w:tcPr>
+          <w:p>
+            <w:r/>
+            <w:r>
+              <w:rPr>
+                <w:sz w:val="17"/>
+              </w:rPr>
+              <w:t>En cours</w:t>
+            </w:r>
+          </w:p>
+        </w:tc>
+        <w:tc>
+          <w:tcPr>
+            <w:tcW w:type="dxa" w:w="1994"/>
+          </w:tcPr>
+          <w:p>
+            <w:r/>
+            <w:r>
+              <w:rPr>
+                <w:sz w:val="17"/>
+              </w:rPr>
+              <w:t>Pas commencé</w:t>
+            </w:r>
+          </w:p>
+        </w:tc>
+        <w:tc>
+          <w:tcPr>
+            <w:tcW w:type="dxa" w:w="1994"/>
+          </w:tcPr>
+          <w:p>
+            <w:r/>
+            <w:r>
+              <w:rPr>
+                <w:sz w:val="17"/>
+              </w:rPr>
+              <w:t>Pas commencé</w:t>
+            </w:r>
+          </w:p>
+        </w:tc>
+      </w:tr>
+      <w:tr>
+        <w:tc>
+          <w:tcPr>
+            <w:tcW w:type="dxa" w:w="1994"/>
+          </w:tcPr>
+          <w:p>
+            <w:r/>
+            <w:r>
+              <w:rPr>
+                <w:sz w:val="17"/>
+              </w:rPr>
+              <w:t>**≥ 30 %**</w:t>
+            </w:r>
+          </w:p>
+        </w:tc>
+        <w:tc>
+          <w:tcPr>
+            <w:tcW w:type="dxa" w:w="1994"/>
+          </w:tcPr>
+          <w:p>
+            <w:r/>
+            <w:r>
+              <w:rPr>
+                <w:sz w:val="17"/>
+              </w:rPr>
+              <w:t>En cours</w:t>
+            </w:r>
+          </w:p>
+        </w:tc>
+        <w:tc>
+          <w:tcPr>
+            <w:tcW w:type="dxa" w:w="1994"/>
+          </w:tcPr>
+          <w:p>
+            <w:r/>
+            <w:r>
+              <w:rPr>
+                <w:sz w:val="17"/>
+              </w:rPr>
+              <w:t>Pas commencé</w:t>
+            </w:r>
+          </w:p>
+        </w:tc>
+        <w:tc>
+          <w:tcPr>
+            <w:tcW w:type="dxa" w:w="1994"/>
+          </w:tcPr>
+          <w:p>
+            <w:r/>
+            <w:r>
+              <w:rPr>
+                <w:sz w:val="17"/>
+              </w:rPr>
+              <w:t>Pas commencé</w:t>
+            </w:r>
+          </w:p>
+        </w:tc>
+        <w:tc>
+          <w:tcPr>
+            <w:tcW w:type="dxa" w:w="1994"/>
+          </w:tcPr>
+          <w:p>
+            <w:r/>
+            <w:r>
+              <w:rPr>
+                <w:sz w:val="17"/>
+              </w:rPr>
+              <w:t>Pas commencé</w:t>
+            </w:r>
+          </w:p>
+        </w:tc>
+      </w:tr>
+      <w:tr>
+        <w:tc>
+          <w:tcPr>
+            <w:tcW w:type="dxa" w:w="1994"/>
+          </w:tcPr>
+          <w:p>
+            <w:r/>
+            <w:r>
+              <w:rPr>
+                <w:sz w:val="17"/>
+              </w:rPr>
+              <w:t>**0 %** (planifié)</w:t>
+            </w:r>
+          </w:p>
+        </w:tc>
+        <w:tc>
+          <w:tcPr>
+            <w:tcW w:type="dxa" w:w="1994"/>
+          </w:tcPr>
+          <w:p>
+            <w:r/>
+            <w:r>
+              <w:rPr>
+                <w:sz w:val="17"/>
+              </w:rPr>
+              <w:t>Pas commencé</w:t>
+            </w:r>
+          </w:p>
+        </w:tc>
+        <w:tc>
+          <w:tcPr>
+            <w:tcW w:type="dxa" w:w="1994"/>
+          </w:tcPr>
+          <w:p>
+            <w:r/>
+            <w:r>
+              <w:rPr>
+                <w:sz w:val="17"/>
+              </w:rPr>
+              <w:t>Pas commencé</w:t>
+            </w:r>
+          </w:p>
+        </w:tc>
+        <w:tc>
+          <w:tcPr>
+            <w:tcW w:type="dxa" w:w="1994"/>
+          </w:tcPr>
+          <w:p>
+            <w:r/>
+            <w:r>
+              <w:rPr>
+                <w:sz w:val="17"/>
+              </w:rPr>
+              <w:t>Pas commencé</w:t>
+            </w:r>
+          </w:p>
+        </w:tc>
+        <w:tc>
+          <w:tcPr>
+            <w:tcW w:type="dxa" w:w="1994"/>
+          </w:tcPr>
+          <w:p>
+            <w:r/>
+            <w:r>
+              <w:rPr>
+                <w:sz w:val="17"/>
+              </w:rPr>
+              <w:t>Pas commencé</w:t>
+            </w:r>
+          </w:p>
+        </w:tc>
+      </w:tr>
+    </w:tbl>
+    <w:p/>
+    <w:p>
+      <w:r>
+        <w:rPr>
+          <w:b w:val="0"/>
+        </w:rPr>
+        <w:t xml:space="preserve">👉 </w:t>
+      </w:r>
+      <w:r>
+        <w:rPr>
+          <w:b/>
+        </w:rPr>
+        <w:t>Toutes les tâches livrées ont donc leurs 4 étapes à « Terminé »</w:t>
+      </w:r>
+      <w:r>
+        <w:rPr>
+          <w:b w:val="0"/>
+        </w:rPr>
+        <w:t xml:space="preserve"> — c'est ce qui montre visuellement à votre responsable que le travail est réellement en production, et pas seulement « fait ».</w:t>
+      </w:r>
+    </w:p>
+    <w:p>
+      <w:pPr>
+        <w:pStyle w:val="Heading2"/>
+      </w:pPr>
+      <w:r>
+        <w:t>Deux façons de les utiliser dans Planner</w:t>
+      </w:r>
+    </w:p>
+    <w:p>
+      <w:r>
+        <w:rPr>
+          <w:b/>
+        </w:rPr>
+        <w:t>1. En colonnes de la vue Grille</w:t>
+      </w:r>
+      <w:r>
+        <w:rPr>
+          <w:b w:val="0"/>
+        </w:rPr>
+        <w:t xml:space="preserve"> (recommandé)</w:t>
+      </w:r>
+    </w:p>
+    <w:p>
+      <w:pPr>
+        <w:pStyle w:val="ListBullet"/>
+      </w:pPr>
+      <w:r>
+        <w:rPr>
+          <w:b w:val="0"/>
+        </w:rPr>
+        <w:t>copier `a-coller-DANS-LA-GRILLE.tsv` -&gt; coller dans la grille : les 4 colonnes</w:t>
+      </w:r>
+    </w:p>
+    <w:p>
+      <w:r>
+        <w:rPr>
+          <w:b w:val="0"/>
+        </w:rPr>
+        <w:t>`Développement`, `Test`, `Pilote`, `Déploiement` sont déjà renseignées</w:t>
+      </w:r>
+    </w:p>
+    <w:p>
+      <w:pPr>
+        <w:pStyle w:val="ListBullet"/>
+      </w:pPr>
+      <w:r>
+        <w:rPr>
+          <w:b w:val="0"/>
+        </w:rPr>
+        <w:t xml:space="preserve">si Planner ne propose pas ces colonnes : </w:t>
+      </w:r>
+      <w:r>
+        <w:rPr>
+          <w:b/>
+        </w:rPr>
+        <w:t>Ajouter une colonne</w:t>
+      </w:r>
+      <w:r>
+        <w:rPr>
+          <w:b w:val="0"/>
+        </w:rPr>
+        <w:t xml:space="preserve"> et choisir</w:t>
+      </w:r>
+    </w:p>
+    <w:p>
+      <w:r>
+        <w:rPr>
+          <w:b w:val="0"/>
+        </w:rPr>
+        <w:t>Texte* ou *Choix*, puis nommer la colonne</w:t>
+      </w:r>
+    </w:p>
+    <w:p>
+      <w:r>
+        <w:rPr>
+          <w:b/>
+        </w:rPr>
+        <w:t>2. En checklist à l'intérieur de chaque tâche</w:t>
+      </w:r>
+    </w:p>
+    <w:p>
+      <w:pPr>
+        <w:pStyle w:val="ListBullet"/>
+      </w:pPr>
+      <w:r>
+        <w:rPr>
+          <w:b w:val="0"/>
+        </w:rPr>
+        <w:t xml:space="preserve">ouvrir la tâche -&gt; </w:t>
+      </w:r>
+      <w:r>
+        <w:rPr>
+          <w:b/>
+        </w:rPr>
+        <w:t>Checklist</w:t>
+      </w:r>
+      <w:r>
+        <w:rPr>
+          <w:b w:val="0"/>
+        </w:rPr>
+        <w:t xml:space="preserve"> -&gt; coller les 4 lignes figurant dans</w:t>
+      </w:r>
+    </w:p>
+    <w:p>
+      <w:r>
+        <w:rPr>
+          <w:b w:val="0"/>
+        </w:rPr>
+        <w:t>`checklists-a-coller.txt` -&gt; cocher celles qui sont faites</w:t>
+      </w:r>
+    </w:p>
+    <w:p>
+      <w:pPr>
+        <w:pStyle w:val="ListBullet"/>
+      </w:pPr>
+      <w:r>
+        <w:rPr>
+          <w:b w:val="0"/>
+        </w:rPr>
+        <w:t>avantage : l'avancement de la checklist s'affiche directement sur la carte</w:t>
+      </w:r>
+    </w:p>
+    <w:p>
+      <w:pPr>
+        <w:pStyle w:val="Heading2"/>
+      </w:pPr>
+      <w:r>
+        <w:t>Ajouter les tâches par étape</w:t>
+      </w:r>
+    </w:p>
+    <w:p>
+      <w:r>
+        <w:rPr>
+          <w:b w:val="0"/>
+        </w:rPr>
+        <w:t xml:space="preserve">Le fichier `a-coller-TACHES-PAR-ETAPE.txt` décompose chaque fonctionnalité </w:t>
+      </w:r>
+      <w:r>
+        <w:rPr>
+          <w:b/>
+        </w:rPr>
+        <w:t>en cours ou planifiée</w:t>
+      </w:r>
+      <w:r>
+        <w:rPr>
+          <w:b w:val="0"/>
+        </w:rPr>
+        <w:t xml:space="preserve"> en 4 tâches distinctes :</w:t>
+      </w:r>
+    </w:p>
+    <w:p>
+      <w:r>
+        <w:rPr>
+          <w:rFonts w:ascii="Consolas" w:hAnsi="Consolas"/>
+          <w:sz w:val="17"/>
+        </w:rPr>
+        <w:t>### Journal d'audit des actions sensibles [Sécurité]</w:t>
+        <w:br/>
+        <w:t>Développement — Journal d'audit des actions sensibles</w:t>
+        <w:br/>
+        <w:t>Test — Journal d'audit des actions sensibles</w:t>
+        <w:br/>
+        <w:t>Pilote — Journal d'audit des actions sensibles</w:t>
+        <w:br/>
+        <w:t>Déploiement — Journal d'audit des actions sensibles</w:t>
+      </w:r>
+    </w:p>
+    <w:p>
+      <w:r>
+        <w:rPr>
+          <w:b w:val="0"/>
+        </w:rPr>
+        <w:t>À coller dans le compartiment `🔄 En cours` ou `📅 Planifié`. Les fonctionnalités déjà livrées n'y figurent pas (leurs 4 étapes sont terminées).</w:t>
+      </w:r>
+    </w:p>
+    <w:p>
+      <w:pPr>
+        <w:pStyle w:val="Heading1"/>
+      </w:pPr>
+      <w:r>
         <w:t>Contenu du dossier `docs/planner/`</w:t>
       </w:r>
     </w:p>
@@ -1597,7 +2460,7 @@
               <w:rPr>
                 <w:sz w:val="17"/>
               </w:rPr>
-              <w:t>**les 44 tâches formatées pour la vue Grille (9 colonnes) — à coller directement**</w:t>
+              <w:t>⭐ **les 44 tâches formatées pour la vue Grille — 13 colonnes dont Développement / Test / Pilote / Déploiement — à coller directement**</w:t>
             </w:r>
           </w:p>
         </w:tc>
@@ -1628,6 +2491,66 @@
                 <w:sz w:val="17"/>
               </w:rPr>
               <w:t>idem au format CSV (séparateur point-virgule)</w:t>
+            </w:r>
+          </w:p>
+        </w:tc>
+      </w:tr>
+      <w:tr>
+        <w:tc>
+          <w:tcPr>
+            <w:tcW w:type="dxa" w:w="4986"/>
+          </w:tcPr>
+          <w:p>
+            <w:r/>
+            <w:r>
+              <w:rPr>
+                <w:sz w:val="17"/>
+              </w:rPr>
+              <w:t>**`a-coller-TACHES-PAR-ETAPE.txt`**</w:t>
+            </w:r>
+          </w:p>
+        </w:tc>
+        <w:tc>
+          <w:tcPr>
+            <w:tcW w:type="dxa" w:w="4986"/>
+          </w:tcPr>
+          <w:p>
+            <w:r/>
+            <w:r>
+              <w:rPr>
+                <w:sz w:val="17"/>
+              </w:rPr>
+              <w:t>chaque fonctionnalité en cours ou planifiée déclinée en 4 tâches (Développement, Test, Pilote, Déploiement)</w:t>
+            </w:r>
+          </w:p>
+        </w:tc>
+      </w:tr>
+      <w:tr>
+        <w:tc>
+          <w:tcPr>
+            <w:tcW w:type="dxa" w:w="4986"/>
+          </w:tcPr>
+          <w:p>
+            <w:r/>
+            <w:r>
+              <w:rPr>
+                <w:sz w:val="17"/>
+              </w:rPr>
+              <w:t>**`checklists-a-coller.txt`**</w:t>
+            </w:r>
+          </w:p>
+        </w:tc>
+        <w:tc>
+          <w:tcPr>
+            <w:tcW w:type="dxa" w:w="4986"/>
+          </w:tcPr>
+          <w:p>
+            <w:r/>
+            <w:r>
+              <w:rPr>
+                <w:sz w:val="17"/>
+              </w:rPr>
+              <w:t>les 4 étapes à coller dans la checklist de chaque tâche, avec leur état</w:t>
             </w:r>
           </w:p>
         </w:tc>

</xml_diff>